<commit_message>
Remove NDA-sensitive metrics and correct project attribution
Scrub Kreisson-derived performance figures from Experience page, chatbot prompt, and resume. Fix docs to reflect Horizon Legal Docs as an independent project.

Co-authored-by: Cursor <cursoragent@cursor.com>
</commit_message>
<xml_diff>
--- a/public/resume.docx
+++ b/public/resume.docx
@@ -439,7 +439,7 @@
                 <w:color w:val="5B5B5B"/>
                 <w:lang w:val="en-AU" w:eastAsia="en-GB"/>
               </w:rPr>
-              <w:t>Developed an intelligent contract analysis platform for construction contracts, automating clause extraction, risk identification and compliance review — reducing lawyer review time by over 40% per engagement and delivering significant monthly cost savings to the firm.</w:t>
+              <w:t>Developed an intelligent contract analysis platform for construction contracts, automating clause extraction, risk identification and compliance review — significantly reducing the time cost of high-volume contract review.</w:t>
             </w:r>
           </w:p>
           <w:p>
@@ -1421,7 +1421,7 @@
               <w:rPr>
                 <w:lang w:val="en-AU"/>
               </w:rPr>
-              <w:t xml:space="preserve"> Built a production system for automated analysis of complex construction contracts, incorporating multi-phase document extraction, risk identification, and compliance review. Reduced lawyer engagement time by over 40% and delivered measurable monthly cost savings.</w:t>
+              <w:t xml:space="preserve"> Built a production system for automated analysis of complex construction contracts, incorporating multi-phase document extraction, risk identification, and compliance review. Significantly reduced manual review time on complex engagements.</w:t>
             </w:r>
           </w:p>
           <w:p>
@@ -1513,7 +1513,7 @@
               <w:rPr>
                 <w:lang w:val="en-AU"/>
               </w:rPr>
-              <w:t xml:space="preserve"> Built an automated pipeline for legal content research and publication, achieving 95% reduction in content production time through workflow orchestration and LLM integration.</w:t>
+              <w:t xml:space="preserve"> Built an automated pipeline for legal content research and publication, dramatically reducing content production time through workflow orchestration and LLM integration.</w:t>
             </w:r>
           </w:p>
         </w:tc>

</xml_diff>

<commit_message>
Update resume to latest 2026 version
Co-authored-by: Cursor <cursoragent@cursor.com>
</commit_message>
<xml_diff>
--- a/public/resume.docx
+++ b/public/resume.docx
@@ -32,16 +32,26 @@
           <w:p>
             <w:pPr>
               <w:pStyle w:val="Title"/>
+              <w:rPr>
+                <w:sz w:val="56"/>
+              </w:rPr>
             </w:pPr>
             <w:r>
+              <w:rPr>
+                <w:sz w:val="56"/>
+              </w:rPr>
               <w:t>Aaron</w:t>
             </w:r>
             <w:r>
+              <w:rPr>
+                <w:sz w:val="56"/>
+              </w:rPr>
               <w:t xml:space="preserve"> </w:t>
             </w:r>
             <w:r>
               <w:rPr>
                 <w:rStyle w:val="IntenseEmphasis"/>
+                <w:sz w:val="56"/>
               </w:rPr>
               <w:t>kreidieh</w:t>
             </w:r>
@@ -145,7 +155,13 @@
               <w:t xml:space="preserve"> </w:t>
             </w:r>
             <w:r>
-              <w:t>https://aaronk.tech/</w:t>
+              <w:t>https://aaronk.</w:t>
+            </w:r>
+            <w:r>
+              <w:t>dev</w:t>
+            </w:r>
+            <w:r>
+              <w:t>/</w:t>
             </w:r>
           </w:p>
           <w:p>
@@ -205,7 +221,21 @@
               <w:rPr>
                 <w:lang w:val="en-AU"/>
               </w:rPr>
-              <w:t>Proficient in Python, TypeScript, FastAPI, and React, with hands-on experience across the full development stack including infrastructure, distributed computing, and self-hosted server environments. Uniquely positioned to translate complex legal domain requirements into reliable, high-performance technical systems — bridging law, business, and engineering in ways few practitioners can.</w:t>
+              <w:t xml:space="preserve">Proficient in Python, TypeScript, </w:t>
+            </w:r>
+            <w:proofErr w:type="spellStart"/>
+            <w:r>
+              <w:rPr>
+                <w:lang w:val="en-AU"/>
+              </w:rPr>
+              <w:t>FastAPI</w:t>
+            </w:r>
+            <w:proofErr w:type="spellEnd"/>
+            <w:r>
+              <w:rPr>
+                <w:lang w:val="en-AU"/>
+              </w:rPr>
+              <w:t>, and React, with hands-on experience across the full development stack including infrastructure, distributed computing, and self-hosted server environments. Uniquely positioned to translate complex legal domain requirements into reliable, high-performance technical systems bridging law, business, and engineering in ways few practitioners can.</w:t>
             </w:r>
           </w:p>
         </w:tc>
@@ -439,7 +469,7 @@
                 <w:color w:val="5B5B5B"/>
                 <w:lang w:val="en-AU" w:eastAsia="en-GB"/>
               </w:rPr>
-              <w:t>Developed an intelligent contract analysis platform for construction contracts, automating clause extraction, risk identification and compliance review — significantly reducing the time cost of high-volume contract review.</w:t>
+              <w:t>Developed an intelligent contract analysis platform for construction contracts, automating clause extraction, risk identification and compliance review significantly reducing the time cost of high-volume contract review.</w:t>
             </w:r>
           </w:p>
           <w:p>
@@ -520,7 +550,40 @@
                 <w:color w:val="5B5B5B"/>
                 <w:lang w:val="en-AU" w:eastAsia="en-GB"/>
               </w:rPr>
-              <w:t>Operated across the full development stack — from backend api design and database architecture to react frontend interfaces — delivering production-ready systems within a resource-constrained environment.</w:t>
+              <w:t xml:space="preserve">Operated across the full development stack from backend </w:t>
+            </w:r>
+            <w:r>
+              <w:rPr>
+                <w:rFonts w:eastAsiaTheme="minorEastAsia" w:cs="Arial"/>
+                <w:b w:val="0"/>
+                <w:bCs/>
+                <w:caps w:val="0"/>
+                <w:color w:val="5B5B5B"/>
+                <w:lang w:val="en-AU" w:eastAsia="en-GB"/>
+              </w:rPr>
+              <w:t>A</w:t>
+            </w:r>
+            <w:r>
+              <w:rPr>
+                <w:rFonts w:eastAsiaTheme="minorEastAsia" w:cs="Arial"/>
+                <w:b w:val="0"/>
+                <w:bCs/>
+                <w:caps w:val="0"/>
+                <w:color w:val="5B5B5B"/>
+                <w:lang w:val="en-AU" w:eastAsia="en-GB"/>
+              </w:rPr>
+              <w:t>PI</w:t>
+            </w:r>
+            <w:r>
+              <w:rPr>
+                <w:rFonts w:eastAsiaTheme="minorEastAsia" w:cs="Arial"/>
+                <w:b w:val="0"/>
+                <w:bCs/>
+                <w:caps w:val="0"/>
+                <w:color w:val="5B5B5B"/>
+                <w:lang w:val="en-AU" w:eastAsia="en-GB"/>
+              </w:rPr>
+              <w:t xml:space="preserve"> design and database architecture to react frontend interfaces delivering production-ready systems within a resource-constrained environment.</w:t>
             </w:r>
           </w:p>
           <w:p>
@@ -769,7 +832,18 @@
                 <w:color w:val="5B5B5B"/>
                 <w:lang w:val="en-AU" w:eastAsia="en-GB"/>
               </w:rPr>
-              <w:t xml:space="preserve">avascript code for e-signature integrations, ensuring reliable client-facing functionality </w:t>
+              <w:t>avaScript</w:t>
+            </w:r>
+            <w:r>
+              <w:rPr>
+                <w:rFonts w:eastAsiaTheme="minorEastAsia" w:cs="Arial"/>
+                <w:b w:val="0"/>
+                <w:bCs/>
+                <w:caps w:val="0"/>
+                <w:color w:val="5B5B5B"/>
+                <w:lang w:val="en-AU" w:eastAsia="en-GB"/>
+              </w:rPr>
+              <w:t xml:space="preserve"> code for e-signature integrations, ensuring reliable client-facing functionality </w:t>
             </w:r>
           </w:p>
           <w:p>
@@ -796,7 +870,6 @@
                 <w:color w:val="5B5B5B"/>
                 <w:lang w:val="en-AU" w:eastAsia="en-GB"/>
               </w:rPr>
-              <w:lastRenderedPageBreak/>
               <w:t xml:space="preserve">interpreted xml and </w:t>
             </w:r>
             <w:r>
@@ -846,6 +919,7 @@
                 <w:color w:val="5B5B5B"/>
                 <w:lang w:val="en-AU" w:eastAsia="en-GB"/>
               </w:rPr>
+              <w:lastRenderedPageBreak/>
               <w:t xml:space="preserve">conducted it maintenance, software troubleshooting, and antivirus compatibility checks across client environments </w:t>
             </w:r>
           </w:p>
@@ -1141,7 +1215,29 @@
                 <w:szCs w:val="22"/>
                 <w:lang w:val="en-US"/>
               </w:rPr>
-              <w:t>Presented a portfolio of product ideas directly to the CEO, with proposals subsequently adopted for integration into Lawpath's legal services platform</w:t>
+              <w:t xml:space="preserve">Presented a portfolio of product ideas directly to the CEO, with proposals subsequently adopted for integration into </w:t>
+            </w:r>
+            <w:proofErr w:type="spellStart"/>
+            <w:r>
+              <w:rPr>
+                <w:rFonts w:asciiTheme="minorHAnsi" w:hAnsiTheme="minorHAnsi" w:cstheme="minorHAnsi"/>
+                <w:color w:val="5B5B5B"/>
+                <w:sz w:val="22"/>
+                <w:szCs w:val="22"/>
+                <w:lang w:val="en-US"/>
+              </w:rPr>
+              <w:t>Lawpath's</w:t>
+            </w:r>
+            <w:proofErr w:type="spellEnd"/>
+            <w:r>
+              <w:rPr>
+                <w:rFonts w:asciiTheme="minorHAnsi" w:hAnsiTheme="minorHAnsi" w:cstheme="minorHAnsi"/>
+                <w:color w:val="5B5B5B"/>
+                <w:sz w:val="22"/>
+                <w:szCs w:val="22"/>
+                <w:lang w:val="en-US"/>
+              </w:rPr>
+              <w:t xml:space="preserve"> legal services platform</w:t>
             </w:r>
             <w:r>
               <w:rPr>
@@ -1243,7 +1339,21 @@
               <w:rPr>
                 <w:lang w:val="en-AU"/>
               </w:rPr>
-              <w:t xml:space="preserve"> FastAPI, </w:t>
+              <w:t xml:space="preserve"> </w:t>
+            </w:r>
+            <w:proofErr w:type="spellStart"/>
+            <w:r>
+              <w:rPr>
+                <w:lang w:val="en-AU"/>
+              </w:rPr>
+              <w:t>FastAPI</w:t>
+            </w:r>
+            <w:proofErr w:type="spellEnd"/>
+            <w:r>
+              <w:rPr>
+                <w:lang w:val="en-AU"/>
+              </w:rPr>
+              <w:t xml:space="preserve">, </w:t>
             </w:r>
             <w:r>
               <w:rPr>
@@ -1353,8 +1463,16 @@
               <w:rPr>
                 <w:lang w:val="en-AU"/>
               </w:rPr>
-              <w:t xml:space="preserve"> MongoDB, SQL databases, vector databases, Supabase</w:t>
+              <w:t xml:space="preserve"> MongoDB, SQL databases, vector databases, </w:t>
             </w:r>
+            <w:proofErr w:type="spellStart"/>
+            <w:r>
+              <w:rPr>
+                <w:lang w:val="en-AU"/>
+              </w:rPr>
+              <w:t>Supabase</w:t>
+            </w:r>
+            <w:proofErr w:type="spellEnd"/>
           </w:p>
           <w:p>
             <w:pPr>
@@ -1660,7 +1778,15 @@
           </w:p>
           <w:p>
             <w:r>
-              <w:t xml:space="preserve">I am a self-taught programmer with a strong passion for software development. I have taught myself several programming languages, including Python, JavaScript, and Solidity, and have built a number of personal projects to hone my skills. These projects include a Google Docs clone, a magic memory card game, and a neural network to read hand-written digits. I have also developed </w:t>
+              <w:t xml:space="preserve">I am a self-taught programmer with a strong passion for software development. I have taught myself several programming languages, including Python, JavaScript, and Solidity, and have built </w:t>
+            </w:r>
+            <w:proofErr w:type="gramStart"/>
+            <w:r>
+              <w:t>a number of</w:t>
+            </w:r>
+            <w:proofErr w:type="gramEnd"/>
+            <w:r>
+              <w:t xml:space="preserve"> personal projects to hone my skills. These projects include a Google Docs clone, a magic memory card game, and a neural network to read hand-written digits. I have also developed </w:t>
             </w:r>
             <w:r>
               <w:t>knowledge</w:t>
@@ -27821,13 +27947,16 @@
   </w:compat>
   <w:rsids>
     <w:rsidRoot w:val="00C9083C"/>
+    <w:rsid w:val="000C5A86"/>
     <w:rsid w:val="00144F11"/>
     <w:rsid w:val="0015757F"/>
     <w:rsid w:val="00196A89"/>
     <w:rsid w:val="00467A5C"/>
+    <w:rsid w:val="00535081"/>
     <w:rsid w:val="00646586"/>
     <w:rsid w:val="00693552"/>
     <w:rsid w:val="006D16E7"/>
+    <w:rsid w:val="007374E4"/>
     <w:rsid w:val="007576DF"/>
     <w:rsid w:val="00785316"/>
     <w:rsid w:val="00855281"/>
@@ -27835,12 +27964,15 @@
     <w:rsid w:val="00897A12"/>
     <w:rsid w:val="00983A8C"/>
     <w:rsid w:val="00A87B52"/>
+    <w:rsid w:val="00B532CD"/>
     <w:rsid w:val="00B5566A"/>
     <w:rsid w:val="00BD1910"/>
     <w:rsid w:val="00C061F8"/>
     <w:rsid w:val="00C75B33"/>
     <w:rsid w:val="00C9083C"/>
     <w:rsid w:val="00D470B5"/>
+    <w:rsid w:val="00E22152"/>
+    <w:rsid w:val="00EA26E5"/>
     <w:rsid w:val="00F902E5"/>
     <w:rsid w:val="00FE1BA7"/>
     <w:rsid w:val="00FF2572"/>

</xml_diff>